<commit_message>
docs(exercises): add sample solutions for 3.1.x exercises
Update five Excel workbooks and the 3.1.4 question document with sample solutions.

AI-agent: Codex
AI-model: GPT-6
</commit_message>
<xml_diff>
--- a/3.1.4-素材/3.1.4试题.docx
+++ b/3.1.4-素材/3.1.4试题.docx
@@ -1250,7 +1250,98 @@
       </w:r>
     </w:p>
     <w:p/>
-    <w:p/>
+    <w:p>
+      <w:r>
+        <w:drawing>
+          <wp:inline distT="0" distB="0" distL="0" distR="0" wp14:anchorId="2A6B3661" wp14:editId="6E11F17D">
+            <wp:extent cx="7353300" cy="5651500"/>
+            <wp:effectExtent l="0" t="0" r="0" b="0"/>
+            <wp:docPr id="214438361" name="Picture 1"/>
+            <wp:cNvGraphicFramePr>
+              <a:graphicFrameLocks xmlns:a="http://schemas.openxmlformats.org/drawingml/2006/main" noChangeAspect="1"/>
+            </wp:cNvGraphicFramePr>
+            <a:graphic xmlns:a="http://schemas.openxmlformats.org/drawingml/2006/main">
+              <a:graphicData uri="http://schemas.openxmlformats.org/drawingml/2006/picture">
+                <pic:pic xmlns:pic="http://schemas.openxmlformats.org/drawingml/2006/picture">
+                  <pic:nvPicPr>
+                    <pic:cNvPr id="214438361" name=""/>
+                    <pic:cNvPicPr/>
+                  </pic:nvPicPr>
+                  <pic:blipFill>
+                    <a:blip r:embed="rId4"/>
+                    <a:stretch>
+                      <a:fillRect/>
+                    </a:stretch>
+                  </pic:blipFill>
+                  <pic:spPr>
+                    <a:xfrm>
+                      <a:off x="0" y="0"/>
+                      <a:ext cx="7353300" cy="5651500"/>
+                    </a:xfrm>
+                    <a:prstGeom prst="rect">
+                      <a:avLst/>
+                    </a:prstGeom>
+                  </pic:spPr>
+                </pic:pic>
+              </a:graphicData>
+            </a:graphic>
+          </wp:inline>
+        </w:drawing>
+      </w:r>
+    </w:p>
+    <w:p>
+      <w:pPr>
+        <w:rPr>
+          <w:rFonts w:hint="eastAsia"/>
+        </w:rPr>
+      </w:pPr>
+    </w:p>
+    <w:p>
+      <w:r>
+        <w:drawing>
+          <wp:inline distT="0" distB="0" distL="0" distR="0" wp14:anchorId="327FB6F7" wp14:editId="689AFC9E">
+            <wp:extent cx="5753100" cy="3390900"/>
+            <wp:effectExtent l="0" t="0" r="0" b="0"/>
+            <wp:docPr id="1093411453" name="Picture 1"/>
+            <wp:cNvGraphicFramePr>
+              <a:graphicFrameLocks xmlns:a="http://schemas.openxmlformats.org/drawingml/2006/main" noChangeAspect="1"/>
+            </wp:cNvGraphicFramePr>
+            <a:graphic xmlns:a="http://schemas.openxmlformats.org/drawingml/2006/main">
+              <a:graphicData uri="http://schemas.openxmlformats.org/drawingml/2006/picture">
+                <pic:pic xmlns:pic="http://schemas.openxmlformats.org/drawingml/2006/picture">
+                  <pic:nvPicPr>
+                    <pic:cNvPr id="1093411453" name=""/>
+                    <pic:cNvPicPr/>
+                  </pic:nvPicPr>
+                  <pic:blipFill>
+                    <a:blip r:embed="rId5"/>
+                    <a:stretch>
+                      <a:fillRect/>
+                    </a:stretch>
+                  </pic:blipFill>
+                  <pic:spPr>
+                    <a:xfrm>
+                      <a:off x="0" y="0"/>
+                      <a:ext cx="5753100" cy="3390900"/>
+                    </a:xfrm>
+                    <a:prstGeom prst="rect">
+                      <a:avLst/>
+                    </a:prstGeom>
+                  </pic:spPr>
+                </pic:pic>
+              </a:graphicData>
+            </a:graphic>
+          </wp:inline>
+        </w:drawing>
+      </w:r>
+    </w:p>
+    <w:p>
+      <w:pPr>
+        <w:rPr>
+          <w:rFonts w:hint="eastAsia"/>
+        </w:rPr>
+      </w:pPr>
+    </w:p>
     <w:p>
       <w:pPr>
         <w:spacing w:before="225" w:after="120" w:line="240" w:lineRule="auto"/>
@@ -2405,13 +2496,7 @@
         <w:t>1. 使用更先进的检测设备和软件，根据检测的结果，实时给予反馈和推荐。</w:t>
       </w:r>
     </w:p>
-    <w:p>
-      <w:pPr>
-        <w:rPr>
-          <w:rFonts w:hint="eastAsia"/>
-        </w:rPr>
-      </w:pPr>
-    </w:p>
+    <w:p/>
     <w:sectPr>
       <w:pgSz w:w="12240" w:h="15840"/>
       <w:pgMar w:top="1440" w:right="1440" w:bottom="1440" w:left="1440" w:header="720" w:footer="720" w:gutter="0"/>

</xml_diff>